<commit_message>
idk , i don't remember this part
</commit_message>
<xml_diff>
--- a/Assignment3_Grammar Correction and Legal Case Similarity Retrieval/report.docx
+++ b/Assignment3_Grammar Correction and Legal Case Similarity Retrieval/report.docx
@@ -30,15 +30,38 @@
           <w:bCs/>
         </w:rPr>
         <w:br/>
-        <w:t>Student: Tauha Imran</w:t>
+        <w:t xml:space="preserve">Student: </w:t>
+      </w:r>
+      <w:proofErr w:type="spellStart"/>
+      <w:r>
+        <w:rPr>
+          <w:b/>
+          <w:bCs/>
+        </w:rPr>
+        <w:t>Sarimmm</w:t>
+      </w:r>
+      <w:proofErr w:type="spellEnd"/>
+      <w:r>
+        <w:rPr>
+          <w:b/>
+          <w:bCs/>
+        </w:rPr>
+        <w:br/>
+        <w:t>Roll Number: i22</w:t>
       </w:r>
       <w:r>
         <w:rPr>
           <w:b/>
           <w:bCs/>
         </w:rPr>
-        <w:br/>
-        <w:t>Roll Number: i221239 – Section B</w:t>
+        <w:t>1280</w:t>
+      </w:r>
+      <w:r>
+        <w:rPr>
+          <w:b/>
+          <w:bCs/>
+        </w:rPr>
+        <w:t xml:space="preserve"> – Section B</w:t>
       </w:r>
       <w:r>
         <w:rPr>
@@ -52,1506 +75,8 @@
     <w:p>
       <w:r>
         <w:pict w14:anchorId="1039971C">
-          <v:rect id="_x0000_i1163" style="width:0;height:1.5pt" o:hralign="center" o:hrstd="t" o:hrnoshade="t" o:hr="t" fillcolor="#ccc" stroked="f"/>
+          <v:rect id="_x0000_i1025" style="width:0;height:1.5pt" o:hralign="center" o:hrstd="t" o:hrnoshade="t" o:hr="t" fillcolor="#ccc" stroked="f"/>
         </w:pict>
-      </w:r>
-    </w:p>
-    <w:p>
-      <w:pPr>
-        <w:pStyle w:val="Heading1"/>
-      </w:pPr>
-      <w:r>
-        <w:t>1. Introduction</w:t>
-      </w:r>
-    </w:p>
-    <w:p>
-      <w:r>
-        <w:t>This project extends Assignment 2 by (1) improving abstractive summaries through automated grammar correction and POS-based linguistic refinement, and (2) building a legal case similarity retrieval system using document embeddings. The objectives were: (a) increase summary readability and fluency without changing legal meaning; and (b) demonstrate semantic retrieval of similar cases using cosine similarity over case-level embeddings. The deliverables include corrected summaries, saved embeddings, top-K similarity results, and an organized notebook showing code, results and a short evaluation.</w:t>
-      </w:r>
-    </w:p>
-    <w:p>
-      <w:r>
-        <w:pict w14:anchorId="5FE1F07B">
-          <v:rect id="_x0000_i1165" style="width:0;height:1.5pt" o:hralign="center" o:hrstd="t" o:hrnoshade="t" o:hr="t" fillcolor="#ccc" stroked="f"/>
-        </w:pict>
-      </w:r>
-    </w:p>
-    <w:p>
-      <w:pPr>
-        <w:pStyle w:val="Heading1"/>
-      </w:pPr>
-      <w:r>
-        <w:t xml:space="preserve">2. </w:t>
-      </w:r>
-      <w:r>
-        <w:t>Repository / Attached Files</w:t>
-      </w:r>
-    </w:p>
-    <w:p/>
-    <w:p>
-      <w:r>
-        <w:t>Files included in the submission (names and expected contents):</w:t>
-      </w:r>
-    </w:p>
-    <w:p>
-      <w:pPr>
-        <w:numPr>
-          <w:ilvl w:val="0"/>
-          <w:numId w:val="12"/>
-        </w:numPr>
-      </w:pPr>
-      <w:r>
-        <w:t>i221239_A3.ipynb or </w:t>
-      </w:r>
-      <w:hyperlink r:id="rId5" w:history="1">
-        <w:r>
-          <w:rPr>
-            <w:rStyle w:val="Hyperlink"/>
-          </w:rPr>
-          <w:t>i221239.ipynb</w:t>
-        </w:r>
-      </w:hyperlink>
-      <w:r>
-        <w:t xml:space="preserve"> — </w:t>
-      </w:r>
-      <w:proofErr w:type="spellStart"/>
-      <w:r>
-        <w:t>Jupyter</w:t>
-      </w:r>
-      <w:proofErr w:type="spellEnd"/>
-      <w:r>
-        <w:t xml:space="preserve"> notebook containing code, experiments and outputs.</w:t>
-      </w:r>
-    </w:p>
-    <w:p>
-      <w:pPr>
-        <w:numPr>
-          <w:ilvl w:val="0"/>
-          <w:numId w:val="12"/>
-        </w:numPr>
-      </w:pPr>
-      <w:r>
-        <w:t xml:space="preserve">corrected_summaries.csv — CSV with columns: </w:t>
-      </w:r>
-      <w:proofErr w:type="spellStart"/>
-      <w:r>
-        <w:t>case_no</w:t>
-      </w:r>
-      <w:proofErr w:type="spellEnd"/>
-      <w:r>
-        <w:t xml:space="preserve">, </w:t>
-      </w:r>
-      <w:proofErr w:type="spellStart"/>
-      <w:r>
-        <w:t>original_summary</w:t>
-      </w:r>
-      <w:proofErr w:type="spellEnd"/>
-      <w:r>
-        <w:t xml:space="preserve">, </w:t>
-      </w:r>
-      <w:proofErr w:type="spellStart"/>
-      <w:r>
-        <w:t>corrected_summary</w:t>
-      </w:r>
-      <w:proofErr w:type="spellEnd"/>
-      <w:r>
-        <w:t>.</w:t>
-      </w:r>
-    </w:p>
-    <w:p>
-      <w:pPr>
-        <w:numPr>
-          <w:ilvl w:val="0"/>
-          <w:numId w:val="12"/>
-        </w:numPr>
-      </w:pPr>
-      <w:proofErr w:type="spellStart"/>
-      <w:r>
-        <w:t>case_embeddings.npy</w:t>
-      </w:r>
-      <w:proofErr w:type="spellEnd"/>
-      <w:r>
-        <w:t> or case_embeddings.csv — case-level embeddings (one vector per case).</w:t>
-      </w:r>
-    </w:p>
-    <w:p>
-      <w:pPr>
-        <w:numPr>
-          <w:ilvl w:val="0"/>
-          <w:numId w:val="12"/>
-        </w:numPr>
-      </w:pPr>
-      <w:r>
-        <w:t xml:space="preserve">retrieval_results.csv — Top-K retrieval results: </w:t>
-      </w:r>
-      <w:proofErr w:type="spellStart"/>
-      <w:r>
-        <w:t>query_case_no</w:t>
-      </w:r>
-      <w:proofErr w:type="spellEnd"/>
-      <w:r>
-        <w:t xml:space="preserve">, </w:t>
-      </w:r>
-      <w:proofErr w:type="spellStart"/>
-      <w:r>
-        <w:t>similar_case_no</w:t>
-      </w:r>
-      <w:proofErr w:type="spellEnd"/>
-      <w:r>
-        <w:t xml:space="preserve">, </w:t>
-      </w:r>
-      <w:proofErr w:type="spellStart"/>
-      <w:r>
-        <w:t>similarity_score</w:t>
-      </w:r>
-      <w:proofErr w:type="spellEnd"/>
-      <w:r>
-        <w:t>.</w:t>
-      </w:r>
-    </w:p>
-    <w:p>
-      <w:pPr>
-        <w:numPr>
-          <w:ilvl w:val="0"/>
-          <w:numId w:val="12"/>
-        </w:numPr>
-      </w:pPr>
-      <w:r>
-        <w:t>requirements.txt — exact pip packages + versions used to reproduce the environment.</w:t>
-      </w:r>
-    </w:p>
-    <w:p>
-      <w:pPr>
-        <w:numPr>
-          <w:ilvl w:val="0"/>
-          <w:numId w:val="12"/>
-        </w:numPr>
-      </w:pPr>
-      <w:r>
-        <w:t>report.pdf — this document exported to PDF.</w:t>
-      </w:r>
-    </w:p>
-    <w:p>
-      <w:pPr>
-        <w:numPr>
-          <w:ilvl w:val="0"/>
-          <w:numId w:val="12"/>
-        </w:numPr>
-      </w:pPr>
-      <w:r>
-        <w:t>(Optional) Small visualization files (e.g., embeddings_tsne.png) if available.</w:t>
-      </w:r>
-    </w:p>
-    <w:p>
-      <w:r>
-        <w:lastRenderedPageBreak/>
-        <w:t>Note: Please open the notebook to view the full comparison table and retrieval outputs.</w:t>
-      </w:r>
-    </w:p>
-    <w:p>
-      <w:r>
-        <w:pict w14:anchorId="41B7D35C">
-          <v:rect id="_x0000_i1167" style="width:0;height:1.5pt" o:hralign="center" o:hrstd="t" o:hrnoshade="t" o:hr="t" fillcolor="#ccc" stroked="f"/>
-        </w:pict>
-      </w:r>
-    </w:p>
-    <w:p>
-      <w:pPr>
-        <w:pStyle w:val="Heading1"/>
-      </w:pPr>
-      <w:r>
-        <w:t xml:space="preserve">3. </w:t>
-      </w:r>
-      <w:r>
-        <w:t>Part 1 — Grammar Correction &amp; Summary Refinement</w:t>
-      </w:r>
-    </w:p>
-    <w:p/>
-    <w:p>
-      <w:pPr>
-        <w:pStyle w:val="Heading2"/>
-      </w:pPr>
-      <w:r>
-        <w:t>3.1 Approach</w:t>
-      </w:r>
-    </w:p>
-    <w:p>
-      <w:pPr>
-        <w:numPr>
-          <w:ilvl w:val="0"/>
-          <w:numId w:val="14"/>
-        </w:numPr>
-      </w:pPr>
-      <w:r>
-        <w:t>Input: abstractive summaries generated in Assignment 2 (one summary per case).</w:t>
-      </w:r>
-    </w:p>
-    <w:p>
-      <w:pPr>
-        <w:numPr>
-          <w:ilvl w:val="0"/>
-          <w:numId w:val="14"/>
-        </w:numPr>
-      </w:pPr>
-      <w:r>
-        <w:t>Pre-processing: normalize whitespace and punctuation; preserve legal tokens such as case numbers and statutory citations.</w:t>
-      </w:r>
-    </w:p>
-    <w:p>
-      <w:pPr>
-        <w:numPr>
-          <w:ilvl w:val="0"/>
-          <w:numId w:val="14"/>
-        </w:numPr>
-      </w:pPr>
-      <w:r>
-        <w:t>Automatic grammar correction:</w:t>
-      </w:r>
-    </w:p>
-    <w:p>
-      <w:pPr>
-        <w:numPr>
-          <w:ilvl w:val="1"/>
-          <w:numId w:val="14"/>
-        </w:numPr>
-      </w:pPr>
-      <w:r>
-        <w:t>When available, a lightweight grammar-correction tool (library) was used with conservative settings to avoid meaning change.</w:t>
-      </w:r>
-    </w:p>
-    <w:p>
-      <w:pPr>
-        <w:numPr>
-          <w:ilvl w:val="1"/>
-          <w:numId w:val="14"/>
-        </w:numPr>
-      </w:pPr>
-      <w:r>
-        <w:t xml:space="preserve">When tool dependencies were not available (e.g., Java requirement for </w:t>
-      </w:r>
-      <w:proofErr w:type="spellStart"/>
-      <w:r>
-        <w:t>LanguageTool</w:t>
-      </w:r>
-      <w:proofErr w:type="spellEnd"/>
-      <w:r>
-        <w:t xml:space="preserve">), a robust rule-based pipeline using </w:t>
-      </w:r>
-      <w:proofErr w:type="spellStart"/>
-      <w:r>
-        <w:t>spaCy</w:t>
-      </w:r>
-      <w:proofErr w:type="spellEnd"/>
-      <w:r>
-        <w:t xml:space="preserve"> for POS and dependency parses was used instead.</w:t>
-      </w:r>
-    </w:p>
-    <w:p>
-      <w:pPr>
-        <w:numPr>
-          <w:ilvl w:val="0"/>
-          <w:numId w:val="14"/>
-        </w:numPr>
-      </w:pPr>
-      <w:r>
-        <w:t>POS-based refinement:</w:t>
-      </w:r>
-    </w:p>
-    <w:p>
-      <w:pPr>
-        <w:numPr>
-          <w:ilvl w:val="1"/>
-          <w:numId w:val="14"/>
-        </w:numPr>
-      </w:pPr>
-      <w:r>
-        <w:t>Use POS tags and simple heuristics to enforce subject–verb agreement, ensure article usage (a/an/the), and to remove obvious redundancies.</w:t>
-      </w:r>
-    </w:p>
-    <w:p>
-      <w:pPr>
-        <w:numPr>
-          <w:ilvl w:val="1"/>
-          <w:numId w:val="14"/>
-        </w:numPr>
-      </w:pPr>
-      <w:r>
-        <w:t>Additional steps include capitalization of legal terms (Court, Judge, Appellant) and normalization of auxiliaries (was/were, has/have).</w:t>
-      </w:r>
-    </w:p>
-    <w:p>
-      <w:pPr>
-        <w:numPr>
-          <w:ilvl w:val="0"/>
-          <w:numId w:val="14"/>
-        </w:numPr>
-      </w:pPr>
-      <w:r>
-        <w:t>Heuristic fragment-to-sentence conversion:</w:t>
-      </w:r>
-    </w:p>
-    <w:p>
-      <w:pPr>
-        <w:numPr>
-          <w:ilvl w:val="1"/>
-          <w:numId w:val="14"/>
-        </w:numPr>
-      </w:pPr>
-      <w:r>
-        <w:t>A </w:t>
-      </w:r>
-      <w:proofErr w:type="spellStart"/>
-      <w:r>
-        <w:t>make_</w:t>
-      </w:r>
-      <w:proofErr w:type="gramStart"/>
-      <w:r>
-        <w:t>sentency</w:t>
-      </w:r>
-      <w:proofErr w:type="spellEnd"/>
-      <w:r>
-        <w:t>(</w:t>
-      </w:r>
-      <w:proofErr w:type="gramEnd"/>
-      <w:r>
-        <w:t>) step converts keyword-style fragments into natural sentence forms (heuristic reconstruction).</w:t>
-      </w:r>
-    </w:p>
-    <w:p>
-      <w:pPr>
-        <w:numPr>
-          <w:ilvl w:val="0"/>
-          <w:numId w:val="14"/>
-        </w:numPr>
-      </w:pPr>
-      <w:r>
-        <w:t xml:space="preserve">Post-processing: punctuation and spacing </w:t>
-      </w:r>
-      <w:proofErr w:type="spellStart"/>
-      <w:r>
-        <w:t>normalisation</w:t>
-      </w:r>
-      <w:proofErr w:type="spellEnd"/>
-      <w:r>
-        <w:t>, and consistency fixes.</w:t>
-      </w:r>
-    </w:p>
-    <w:p>
-      <w:pPr>
-        <w:numPr>
-          <w:ilvl w:val="0"/>
-          <w:numId w:val="14"/>
-        </w:numPr>
-      </w:pPr>
-      <w:r>
-        <w:t>Quality control:</w:t>
-      </w:r>
-    </w:p>
-    <w:p>
-      <w:pPr>
-        <w:numPr>
-          <w:ilvl w:val="1"/>
-          <w:numId w:val="14"/>
-        </w:numPr>
-      </w:pPr>
-      <w:r>
-        <w:t>A random sample of corrected summaries was manually inspected to ensure legal meaning was preserved.</w:t>
-      </w:r>
-    </w:p>
-    <w:p>
-      <w:pPr>
-        <w:numPr>
-          <w:ilvl w:val="1"/>
-          <w:numId w:val="14"/>
-        </w:numPr>
-      </w:pPr>
-      <w:r>
-        <w:t>Conservative edits were preferred: when in doubt the original phrasing was retained or flagged for manual review.</w:t>
-      </w:r>
-    </w:p>
-    <w:p>
-      <w:pPr>
-        <w:pStyle w:val="Heading2"/>
-      </w:pPr>
-      <w:r>
-        <w:lastRenderedPageBreak/>
-        <w:t>3.2 Output</w:t>
-      </w:r>
-    </w:p>
-    <w:p>
-      <w:pPr>
-        <w:numPr>
-          <w:ilvl w:val="0"/>
-          <w:numId w:val="15"/>
-        </w:numPr>
-      </w:pPr>
-      <w:r>
-        <w:t>corrected_summaries.csv with columns: </w:t>
-      </w:r>
-      <w:proofErr w:type="spellStart"/>
-      <w:r>
-        <w:t>case_no</w:t>
-      </w:r>
-      <w:proofErr w:type="spellEnd"/>
-      <w:r>
-        <w:t xml:space="preserve">, </w:t>
-      </w:r>
-      <w:proofErr w:type="spellStart"/>
-      <w:r>
-        <w:t>original_summary</w:t>
-      </w:r>
-      <w:proofErr w:type="spellEnd"/>
-      <w:r>
-        <w:t xml:space="preserve">, </w:t>
-      </w:r>
-      <w:proofErr w:type="spellStart"/>
-      <w:r>
-        <w:t>corrected_summary</w:t>
-      </w:r>
-      <w:proofErr w:type="spellEnd"/>
-      <w:r>
-        <w:t>.</w:t>
-      </w:r>
-    </w:p>
-    <w:p>
-      <w:pPr>
-        <w:numPr>
-          <w:ilvl w:val="0"/>
-          <w:numId w:val="15"/>
-        </w:numPr>
-      </w:pPr>
-      <w:r>
-        <w:t>Example (replace these example rows with your actual outputs):</w:t>
-      </w:r>
-    </w:p>
-    <w:tbl>
-      <w:tblPr>
-        <w:tblW w:w="7875" w:type="dxa"/>
-        <w:tblBorders>
-          <w:top w:val="single" w:sz="6" w:space="0" w:color="auto"/>
-          <w:left w:val="single" w:sz="6" w:space="0" w:color="auto"/>
-          <w:bottom w:val="single" w:sz="6" w:space="0" w:color="auto"/>
-          <w:right w:val="single" w:sz="6" w:space="0" w:color="auto"/>
-        </w:tblBorders>
-        <w:shd w:val="clear" w:color="auto" w:fill="181818"/>
-        <w:tblCellMar>
-          <w:top w:w="60" w:type="dxa"/>
-          <w:left w:w="90" w:type="dxa"/>
-          <w:bottom w:w="60" w:type="dxa"/>
-          <w:right w:w="90" w:type="dxa"/>
-        </w:tblCellMar>
-        <w:tblLook w:val="04A0" w:firstRow="1" w:lastRow="0" w:firstColumn="1" w:lastColumn="0" w:noHBand="0" w:noVBand="1"/>
-      </w:tblPr>
-      <w:tblGrid>
-        <w:gridCol w:w="1318"/>
-        <w:gridCol w:w="2923"/>
-        <w:gridCol w:w="3634"/>
-      </w:tblGrid>
-      <w:tr>
-        <w:trPr>
-          <w:tblHeader/>
-        </w:trPr>
-        <w:tc>
-          <w:tcPr>
-            <w:tcW w:w="0" w:type="auto"/>
-            <w:tcBorders>
-              <w:top w:val="single" w:sz="6" w:space="0" w:color="auto"/>
-              <w:left w:val="single" w:sz="6" w:space="0" w:color="auto"/>
-              <w:bottom w:val="single" w:sz="6" w:space="0" w:color="auto"/>
-              <w:right w:val="single" w:sz="6" w:space="0" w:color="auto"/>
-            </w:tcBorders>
-            <w:shd w:val="clear" w:color="auto" w:fill="181818"/>
-            <w:vAlign w:val="center"/>
-            <w:hideMark/>
-          </w:tcPr>
-          <w:p>
-            <w:pPr>
-              <w:rPr>
-                <w:b/>
-                <w:bCs/>
-              </w:rPr>
-            </w:pPr>
-            <w:proofErr w:type="spellStart"/>
-            <w:r>
-              <w:rPr>
-                <w:b/>
-                <w:bCs/>
-              </w:rPr>
-              <w:t>case_no</w:t>
-            </w:r>
-            <w:proofErr w:type="spellEnd"/>
-          </w:p>
-        </w:tc>
-        <w:tc>
-          <w:tcPr>
-            <w:tcW w:w="0" w:type="auto"/>
-            <w:tcBorders>
-              <w:top w:val="single" w:sz="6" w:space="0" w:color="auto"/>
-              <w:left w:val="single" w:sz="6" w:space="0" w:color="auto"/>
-              <w:bottom w:val="single" w:sz="6" w:space="0" w:color="auto"/>
-              <w:right w:val="single" w:sz="6" w:space="0" w:color="auto"/>
-            </w:tcBorders>
-            <w:shd w:val="clear" w:color="auto" w:fill="181818"/>
-            <w:vAlign w:val="center"/>
-            <w:hideMark/>
-          </w:tcPr>
-          <w:p>
-            <w:pPr>
-              <w:rPr>
-                <w:b/>
-                <w:bCs/>
-              </w:rPr>
-            </w:pPr>
-            <w:proofErr w:type="spellStart"/>
-            <w:r>
-              <w:rPr>
-                <w:b/>
-                <w:bCs/>
-              </w:rPr>
-              <w:t>original_summary</w:t>
-            </w:r>
-            <w:proofErr w:type="spellEnd"/>
-          </w:p>
-        </w:tc>
-        <w:tc>
-          <w:tcPr>
-            <w:tcW w:w="0" w:type="auto"/>
-            <w:tcBorders>
-              <w:top w:val="single" w:sz="6" w:space="0" w:color="auto"/>
-              <w:left w:val="single" w:sz="6" w:space="0" w:color="auto"/>
-              <w:bottom w:val="single" w:sz="6" w:space="0" w:color="auto"/>
-              <w:right w:val="single" w:sz="6" w:space="0" w:color="auto"/>
-            </w:tcBorders>
-            <w:shd w:val="clear" w:color="auto" w:fill="181818"/>
-            <w:vAlign w:val="center"/>
-            <w:hideMark/>
-          </w:tcPr>
-          <w:p>
-            <w:pPr>
-              <w:rPr>
-                <w:b/>
-                <w:bCs/>
-              </w:rPr>
-            </w:pPr>
-            <w:proofErr w:type="spellStart"/>
-            <w:r>
-              <w:rPr>
-                <w:b/>
-                <w:bCs/>
-              </w:rPr>
-              <w:t>corrected_summary</w:t>
-            </w:r>
-            <w:proofErr w:type="spellEnd"/>
-          </w:p>
-        </w:tc>
-      </w:tr>
-      <w:tr>
-        <w:tc>
-          <w:tcPr>
-            <w:tcW w:w="0" w:type="auto"/>
-            <w:tcBorders>
-              <w:top w:val="single" w:sz="6" w:space="0" w:color="auto"/>
-              <w:left w:val="single" w:sz="6" w:space="0" w:color="auto"/>
-              <w:bottom w:val="single" w:sz="6" w:space="0" w:color="auto"/>
-              <w:right w:val="single" w:sz="6" w:space="0" w:color="auto"/>
-            </w:tcBorders>
-            <w:shd w:val="clear" w:color="auto" w:fill="181818"/>
-            <w:vAlign w:val="center"/>
-            <w:hideMark/>
-          </w:tcPr>
-          <w:p>
-            <w:r>
-              <w:t>C.A.1022-2012</w:t>
-            </w:r>
-          </w:p>
-        </w:tc>
-        <w:tc>
-          <w:tcPr>
-            <w:tcW w:w="0" w:type="auto"/>
-            <w:tcBorders>
-              <w:top w:val="single" w:sz="6" w:space="0" w:color="auto"/>
-              <w:left w:val="single" w:sz="6" w:space="0" w:color="auto"/>
-              <w:bottom w:val="single" w:sz="6" w:space="0" w:color="auto"/>
-              <w:right w:val="single" w:sz="6" w:space="0" w:color="auto"/>
-            </w:tcBorders>
-            <w:shd w:val="clear" w:color="auto" w:fill="181818"/>
-            <w:vAlign w:val="center"/>
-            <w:hideMark/>
-          </w:tcPr>
-          <w:p>
-            <w:r>
-              <w:t>court dismiss the appeal filed by appellant</w:t>
-            </w:r>
-          </w:p>
-        </w:tc>
-        <w:tc>
-          <w:tcPr>
-            <w:tcW w:w="0" w:type="auto"/>
-            <w:tcBorders>
-              <w:top w:val="single" w:sz="6" w:space="0" w:color="auto"/>
-              <w:left w:val="single" w:sz="6" w:space="0" w:color="auto"/>
-              <w:bottom w:val="single" w:sz="6" w:space="0" w:color="auto"/>
-              <w:right w:val="single" w:sz="6" w:space="0" w:color="auto"/>
-            </w:tcBorders>
-            <w:shd w:val="clear" w:color="auto" w:fill="181818"/>
-            <w:vAlign w:val="center"/>
-            <w:hideMark/>
-          </w:tcPr>
-          <w:p>
-            <w:r>
-              <w:t>The Court dismissed the appeal filed by the Appellant.</w:t>
-            </w:r>
-          </w:p>
-        </w:tc>
-      </w:tr>
-      <w:tr>
-        <w:tc>
-          <w:tcPr>
-            <w:tcW w:w="0" w:type="auto"/>
-            <w:tcBorders>
-              <w:top w:val="single" w:sz="6" w:space="0" w:color="auto"/>
-              <w:left w:val="single" w:sz="6" w:space="0" w:color="auto"/>
-              <w:bottom w:val="single" w:sz="6" w:space="0" w:color="auto"/>
-              <w:right w:val="single" w:sz="6" w:space="0" w:color="auto"/>
-            </w:tcBorders>
-            <w:shd w:val="clear" w:color="auto" w:fill="181818"/>
-            <w:vAlign w:val="center"/>
-            <w:hideMark/>
-          </w:tcPr>
-          <w:p>
-            <w:r>
-              <w:t>C.A.1125-2014</w:t>
-            </w:r>
-          </w:p>
-        </w:tc>
-        <w:tc>
-          <w:tcPr>
-            <w:tcW w:w="0" w:type="auto"/>
-            <w:tcBorders>
-              <w:top w:val="single" w:sz="6" w:space="0" w:color="auto"/>
-              <w:left w:val="single" w:sz="6" w:space="0" w:color="auto"/>
-              <w:bottom w:val="single" w:sz="6" w:space="0" w:color="auto"/>
-              <w:right w:val="single" w:sz="6" w:space="0" w:color="auto"/>
-            </w:tcBorders>
-            <w:shd w:val="clear" w:color="auto" w:fill="181818"/>
-            <w:vAlign w:val="center"/>
-            <w:hideMark/>
-          </w:tcPr>
-          <w:p>
-            <w:r>
-              <w:t>appeal file against decision date 29.10.2015</w:t>
-            </w:r>
-          </w:p>
-        </w:tc>
-        <w:tc>
-          <w:tcPr>
-            <w:tcW w:w="0" w:type="auto"/>
-            <w:tcBorders>
-              <w:top w:val="single" w:sz="6" w:space="0" w:color="auto"/>
-              <w:left w:val="single" w:sz="6" w:space="0" w:color="auto"/>
-              <w:bottom w:val="single" w:sz="6" w:space="0" w:color="auto"/>
-              <w:right w:val="single" w:sz="6" w:space="0" w:color="auto"/>
-            </w:tcBorders>
-            <w:shd w:val="clear" w:color="auto" w:fill="181818"/>
-            <w:vAlign w:val="center"/>
-            <w:hideMark/>
-          </w:tcPr>
-          <w:p>
-            <w:r>
-              <w:t>The appeal was filed against the decision dated 29.10.2015.</w:t>
-            </w:r>
-          </w:p>
-        </w:tc>
-      </w:tr>
-      <w:tr>
-        <w:tc>
-          <w:tcPr>
-            <w:tcW w:w="0" w:type="auto"/>
-            <w:tcBorders>
-              <w:top w:val="single" w:sz="6" w:space="0" w:color="auto"/>
-              <w:left w:val="single" w:sz="6" w:space="0" w:color="auto"/>
-              <w:bottom w:val="single" w:sz="6" w:space="0" w:color="auto"/>
-              <w:right w:val="single" w:sz="6" w:space="0" w:color="auto"/>
-            </w:tcBorders>
-            <w:shd w:val="clear" w:color="auto" w:fill="181818"/>
-            <w:vAlign w:val="center"/>
-            <w:hideMark/>
-          </w:tcPr>
-          <w:p>
-            <w:r>
-              <w:t>C.A.1194-2014</w:t>
-            </w:r>
-          </w:p>
-        </w:tc>
-        <w:tc>
-          <w:tcPr>
-            <w:tcW w:w="0" w:type="auto"/>
-            <w:tcBorders>
-              <w:top w:val="single" w:sz="6" w:space="0" w:color="auto"/>
-              <w:left w:val="single" w:sz="6" w:space="0" w:color="auto"/>
-              <w:bottom w:val="single" w:sz="6" w:space="0" w:color="auto"/>
-              <w:right w:val="single" w:sz="6" w:space="0" w:color="auto"/>
-            </w:tcBorders>
-            <w:shd w:val="clear" w:color="auto" w:fill="181818"/>
-            <w:vAlign w:val="center"/>
-            <w:hideMark/>
-          </w:tcPr>
-          <w:p>
-            <w:r>
-              <w:t xml:space="preserve">No.1194 of 2014 </w:t>
-            </w:r>
-            <w:proofErr w:type="spellStart"/>
-            <w:r>
-              <w:t>etc</w:t>
-            </w:r>
-            <w:proofErr w:type="spellEnd"/>
-          </w:p>
-        </w:tc>
-        <w:tc>
-          <w:tcPr>
-            <w:tcW w:w="0" w:type="auto"/>
-            <w:tcBorders>
-              <w:top w:val="single" w:sz="6" w:space="0" w:color="auto"/>
-              <w:left w:val="single" w:sz="6" w:space="0" w:color="auto"/>
-              <w:bottom w:val="single" w:sz="6" w:space="0" w:color="auto"/>
-              <w:right w:val="single" w:sz="6" w:space="0" w:color="auto"/>
-            </w:tcBorders>
-            <w:shd w:val="clear" w:color="auto" w:fill="181818"/>
-            <w:vAlign w:val="center"/>
-            <w:hideMark/>
-          </w:tcPr>
-          <w:p>
-            <w:r>
-              <w:t>No.1194 of 2014 (consolidated case references).</w:t>
-            </w:r>
-          </w:p>
-        </w:tc>
-      </w:tr>
-    </w:tbl>
-    <w:p/>
-    <w:p>
-      <w:pPr>
-        <w:pStyle w:val="Heading2"/>
-      </w:pPr>
-      <w:r>
-        <w:t xml:space="preserve">3.3 Reflection </w:t>
-      </w:r>
-    </w:p>
-    <w:p>
-      <w:r>
-        <w:t>Combining rule-based POS checks with conservative automatic corrections preserved legal meaning while improving fluency. The main challenge was handling legal citations and multi-clause sentences where naive edits may alter meaning; to mitigate this, we limited automated edits to high-confidence cases and left uncertain corrections for manual review. Overall readability and grammatical correctness increased across the test sample.</w:t>
-      </w:r>
-    </w:p>
-    <w:p/>
-    <w:p>
-      <w:r>
-        <w:lastRenderedPageBreak/>
-        <w:drawing>
-          <wp:inline distT="0" distB="0" distL="0" distR="0" wp14:anchorId="7E08DF9C" wp14:editId="4E370F21">
-            <wp:extent cx="5943600" cy="5589905"/>
-            <wp:effectExtent l="0" t="0" r="0" b="0"/>
-            <wp:docPr id="1979872095" name="Picture 1"/>
-            <wp:cNvGraphicFramePr>
-              <a:graphicFrameLocks xmlns:a="http://schemas.openxmlformats.org/drawingml/2006/main" noChangeAspect="1"/>
-            </wp:cNvGraphicFramePr>
-            <a:graphic xmlns:a="http://schemas.openxmlformats.org/drawingml/2006/main">
-              <a:graphicData uri="http://schemas.openxmlformats.org/drawingml/2006/picture">
-                <pic:pic xmlns:pic="http://schemas.openxmlformats.org/drawingml/2006/picture">
-                  <pic:nvPicPr>
-                    <pic:cNvPr id="1979872095" name=""/>
-                    <pic:cNvPicPr/>
-                  </pic:nvPicPr>
-                  <pic:blipFill>
-                    <a:blip r:embed="rId6"/>
-                    <a:stretch>
-                      <a:fillRect/>
-                    </a:stretch>
-                  </pic:blipFill>
-                  <pic:spPr>
-                    <a:xfrm>
-                      <a:off x="0" y="0"/>
-                      <a:ext cx="5943600" cy="5589905"/>
-                    </a:xfrm>
-                    <a:prstGeom prst="rect">
-                      <a:avLst/>
-                    </a:prstGeom>
-                  </pic:spPr>
-                </pic:pic>
-              </a:graphicData>
-            </a:graphic>
-          </wp:inline>
-        </w:drawing>
-      </w:r>
-    </w:p>
-    <w:p>
-      <w:r>
-        <w:pict w14:anchorId="2442C753">
-          <v:rect id="_x0000_i1169" style="width:0;height:1.5pt" o:hralign="center" o:hrstd="t" o:hrnoshade="t" o:hr="t" fillcolor="#ccc" stroked="f"/>
-        </w:pict>
-      </w:r>
-    </w:p>
-    <w:p>
-      <w:pPr>
-        <w:pStyle w:val="Heading1"/>
-      </w:pPr>
-      <w:r>
-        <w:t xml:space="preserve">4. </w:t>
-      </w:r>
-      <w:r>
-        <w:t>Part 2 — Legal Case Similarity Retrieval</w:t>
-      </w:r>
-    </w:p>
-    <w:p>
-      <w:r>
-        <w:pict w14:anchorId="2D8951D5">
-          <v:rect id="_x0000_i1172" style="width:0;height:1.5pt" o:hralign="center" o:hrstd="t" o:hrnoshade="t" o:hr="t" fillcolor="#ccc" stroked="f"/>
-        </w:pict>
-      </w:r>
-    </w:p>
-    <w:p>
-      <w:pPr>
-        <w:pStyle w:val="Heading2"/>
-      </w:pPr>
-      <w:r>
-        <w:t>4</w:t>
-      </w:r>
-      <w:r>
-        <w:t>.1 Approach</w:t>
-      </w:r>
-    </w:p>
-    <w:p>
-      <w:pPr>
-        <w:numPr>
-          <w:ilvl w:val="0"/>
-          <w:numId w:val="20"/>
-        </w:numPr>
-      </w:pPr>
-      <w:r>
-        <w:t>Case representation:</w:t>
-      </w:r>
-    </w:p>
-    <w:p>
-      <w:pPr>
-        <w:numPr>
-          <w:ilvl w:val="1"/>
-          <w:numId w:val="20"/>
-        </w:numPr>
-      </w:pPr>
-      <w:r>
-        <w:t>Sentence embeddings were computed in Assignment 2 (one vector per sentence).</w:t>
-      </w:r>
-    </w:p>
-    <w:p>
-      <w:pPr>
-        <w:numPr>
-          <w:ilvl w:val="1"/>
-          <w:numId w:val="20"/>
-        </w:numPr>
-      </w:pPr>
-      <w:r>
-        <w:lastRenderedPageBreak/>
-        <w:t>Case-level embedding = average (mean pooling) of the case’s sentence embeddings.</w:t>
-      </w:r>
-    </w:p>
-    <w:p>
-      <w:pPr>
-        <w:numPr>
-          <w:ilvl w:val="1"/>
-          <w:numId w:val="20"/>
-        </w:numPr>
-      </w:pPr>
-      <w:r>
-        <w:t>Case embeddings were saved as </w:t>
-      </w:r>
-      <w:proofErr w:type="spellStart"/>
-      <w:r>
-        <w:t>case_embeddings.npy</w:t>
-      </w:r>
-      <w:proofErr w:type="spellEnd"/>
-      <w:r>
-        <w:t> (NumPy array) or case_embeddings.csv.</w:t>
-      </w:r>
-    </w:p>
-    <w:p>
-      <w:pPr>
-        <w:numPr>
-          <w:ilvl w:val="0"/>
-          <w:numId w:val="20"/>
-        </w:numPr>
-      </w:pPr>
-      <w:r>
-        <w:t>Querying:</w:t>
-      </w:r>
-    </w:p>
-    <w:p>
-      <w:pPr>
-        <w:numPr>
-          <w:ilvl w:val="1"/>
-          <w:numId w:val="20"/>
-        </w:numPr>
-      </w:pPr>
-      <w:r>
-        <w:t>For each query case, compute the same pooled embedding and compute cosine similarity with all stored case embeddings.</w:t>
-      </w:r>
-    </w:p>
-    <w:p>
-      <w:pPr>
-        <w:numPr>
-          <w:ilvl w:val="1"/>
-          <w:numId w:val="20"/>
-        </w:numPr>
-      </w:pPr>
-      <w:r>
-        <w:t xml:space="preserve">Similarity formula: </w:t>
-      </w:r>
-      <w:proofErr w:type="gramStart"/>
-      <w:r>
-        <w:t>cosine(</w:t>
-      </w:r>
-      <w:proofErr w:type="gramEnd"/>
-      <w:r>
-        <w:t>u, v) = (u · v) / (||u|| ||v||).</w:t>
-      </w:r>
-    </w:p>
-    <w:p>
-      <w:pPr>
-        <w:numPr>
-          <w:ilvl w:val="0"/>
-          <w:numId w:val="20"/>
-        </w:numPr>
-      </w:pPr>
-      <w:r>
-        <w:t>Ranking:</w:t>
-      </w:r>
-    </w:p>
-    <w:p>
-      <w:pPr>
-        <w:numPr>
-          <w:ilvl w:val="1"/>
-          <w:numId w:val="20"/>
-        </w:numPr>
-      </w:pPr>
-      <w:r>
-        <w:t>Sort by descending cosine similarity and return Top-K similar cases (default K=5; configurable).</w:t>
-      </w:r>
-    </w:p>
-    <w:p>
-      <w:pPr>
-        <w:numPr>
-          <w:ilvl w:val="0"/>
-          <w:numId w:val="20"/>
-        </w:numPr>
-      </w:pPr>
-      <w:r>
-        <w:t>Output:</w:t>
-      </w:r>
-    </w:p>
-    <w:p>
-      <w:pPr>
-        <w:numPr>
-          <w:ilvl w:val="1"/>
-          <w:numId w:val="20"/>
-        </w:numPr>
-      </w:pPr>
-      <w:r>
-        <w:t>retrieval_results.csv with columns: </w:t>
-      </w:r>
-      <w:proofErr w:type="spellStart"/>
-      <w:r>
-        <w:t>query_case_no</w:t>
-      </w:r>
-      <w:proofErr w:type="spellEnd"/>
-      <w:r>
-        <w:t xml:space="preserve">, </w:t>
-      </w:r>
-      <w:proofErr w:type="spellStart"/>
-      <w:r>
-        <w:t>similar_case_no</w:t>
-      </w:r>
-      <w:proofErr w:type="spellEnd"/>
-      <w:r>
-        <w:t xml:space="preserve">, </w:t>
-      </w:r>
-      <w:proofErr w:type="spellStart"/>
-      <w:r>
-        <w:t>similarity_score</w:t>
-      </w:r>
-      <w:proofErr w:type="spellEnd"/>
-      <w:r>
-        <w:t>.</w:t>
-      </w:r>
-    </w:p>
-    <w:p>
-      <w:pPr>
-        <w:pStyle w:val="Heading2"/>
-      </w:pPr>
-      <w:r>
-        <w:t>4</w:t>
-      </w:r>
-      <w:r>
-        <w:t xml:space="preserve">.2 Example output </w:t>
-      </w:r>
-    </w:p>
-    <w:p>
-      <w:pPr>
-        <w:numPr>
-          <w:ilvl w:val="0"/>
-          <w:numId w:val="21"/>
-        </w:numPr>
-      </w:pPr>
-      <w:r>
-        <w:t>retrieval_results.csv</w:t>
-      </w:r>
-    </w:p>
-    <w:p>
-      <w:pPr>
-        <w:ind w:left="360"/>
-        <w:rPr>
-          <w:color w:val="000000" w:themeColor="text1"/>
-          <w:highlight w:val="lightGray"/>
-        </w:rPr>
-      </w:pPr>
-      <w:proofErr w:type="spellStart"/>
-      <w:r>
-        <w:rPr>
-          <w:color w:val="000000" w:themeColor="text1"/>
-          <w:highlight w:val="lightGray"/>
-        </w:rPr>
-        <w:t>query_case_</w:t>
-      </w:r>
-      <w:proofErr w:type="gramStart"/>
-      <w:r>
-        <w:rPr>
-          <w:color w:val="000000" w:themeColor="text1"/>
-          <w:highlight w:val="lightGray"/>
-        </w:rPr>
-        <w:t>no,similar</w:t>
-      </w:r>
-      <w:proofErr w:type="gramEnd"/>
-      <w:r>
-        <w:rPr>
-          <w:color w:val="000000" w:themeColor="text1"/>
-          <w:highlight w:val="lightGray"/>
-        </w:rPr>
-        <w:t>_case_</w:t>
-      </w:r>
-      <w:proofErr w:type="gramStart"/>
-      <w:r>
-        <w:rPr>
-          <w:color w:val="000000" w:themeColor="text1"/>
-          <w:highlight w:val="lightGray"/>
-        </w:rPr>
-        <w:t>no,similarity</w:t>
-      </w:r>
-      <w:proofErr w:type="gramEnd"/>
-      <w:r>
-        <w:rPr>
-          <w:color w:val="000000" w:themeColor="text1"/>
-          <w:highlight w:val="lightGray"/>
-        </w:rPr>
-        <w:t>_score</w:t>
-      </w:r>
-      <w:proofErr w:type="spellEnd"/>
-    </w:p>
-    <w:p>
-      <w:pPr>
-        <w:ind w:left="360"/>
-        <w:rPr>
-          <w:color w:val="000000" w:themeColor="text1"/>
-          <w:highlight w:val="lightGray"/>
-        </w:rPr>
-      </w:pPr>
-      <w:r>
-        <w:rPr>
-          <w:color w:val="000000" w:themeColor="text1"/>
-          <w:highlight w:val="lightGray"/>
-        </w:rPr>
-        <w:t>C</w:t>
-      </w:r>
-      <w:proofErr w:type="gramStart"/>
-      <w:r>
-        <w:rPr>
-          <w:color w:val="000000" w:themeColor="text1"/>
-          <w:highlight w:val="lightGray"/>
-        </w:rPr>
-        <w:t>010,C</w:t>
-      </w:r>
-      <w:proofErr w:type="gramEnd"/>
-      <w:r>
-        <w:rPr>
-          <w:color w:val="000000" w:themeColor="text1"/>
-          <w:highlight w:val="lightGray"/>
-        </w:rPr>
-        <w:t>002,0.95</w:t>
-      </w:r>
-    </w:p>
-    <w:p>
-      <w:pPr>
-        <w:ind w:left="360"/>
-        <w:rPr>
-          <w:color w:val="000000" w:themeColor="text1"/>
-          <w:highlight w:val="lightGray"/>
-        </w:rPr>
-      </w:pPr>
-      <w:r>
-        <w:rPr>
-          <w:color w:val="000000" w:themeColor="text1"/>
-          <w:highlight w:val="lightGray"/>
-        </w:rPr>
-        <w:t>C</w:t>
-      </w:r>
-      <w:proofErr w:type="gramStart"/>
-      <w:r>
-        <w:rPr>
-          <w:color w:val="000000" w:themeColor="text1"/>
-          <w:highlight w:val="lightGray"/>
-        </w:rPr>
-        <w:t>010,C</w:t>
-      </w:r>
-      <w:proofErr w:type="gramEnd"/>
-      <w:r>
-        <w:rPr>
-          <w:color w:val="000000" w:themeColor="text1"/>
-          <w:highlight w:val="lightGray"/>
-        </w:rPr>
-        <w:t>001,0.92</w:t>
-      </w:r>
-    </w:p>
-    <w:p>
-      <w:pPr>
-        <w:ind w:left="360"/>
-        <w:rPr>
-          <w:color w:val="000000" w:themeColor="text1"/>
-        </w:rPr>
-      </w:pPr>
-      <w:r>
-        <w:rPr>
-          <w:color w:val="000000" w:themeColor="text1"/>
-          <w:highlight w:val="lightGray"/>
-        </w:rPr>
-        <w:t>C</w:t>
-      </w:r>
-      <w:proofErr w:type="gramStart"/>
-      <w:r>
-        <w:rPr>
-          <w:color w:val="000000" w:themeColor="text1"/>
-          <w:highlight w:val="lightGray"/>
-        </w:rPr>
-        <w:t>010,C</w:t>
-      </w:r>
-      <w:proofErr w:type="gramEnd"/>
-      <w:r>
-        <w:rPr>
-          <w:color w:val="000000" w:themeColor="text1"/>
-          <w:highlight w:val="lightGray"/>
-        </w:rPr>
-        <w:t>005,0.89</w:t>
-      </w:r>
-    </w:p>
-    <w:p>
-      <w:pPr>
-        <w:rPr>
-          <w:color w:val="000000" w:themeColor="text1"/>
-        </w:rPr>
-      </w:pPr>
-      <w:r>
-        <w:rPr>
-          <w:color w:val="000000" w:themeColor="text1"/>
-        </w:rPr>
-        <w:lastRenderedPageBreak/>
-        <w:drawing>
-          <wp:inline distT="0" distB="0" distL="0" distR="0" wp14:anchorId="0ED6A683" wp14:editId="767DFE86">
-            <wp:extent cx="5943600" cy="3607435"/>
-            <wp:effectExtent l="0" t="0" r="0" b="0"/>
-            <wp:docPr id="822803147" name="Picture 1"/>
-            <wp:cNvGraphicFramePr>
-              <a:graphicFrameLocks xmlns:a="http://schemas.openxmlformats.org/drawingml/2006/main" noChangeAspect="1"/>
-            </wp:cNvGraphicFramePr>
-            <a:graphic xmlns:a="http://schemas.openxmlformats.org/drawingml/2006/main">
-              <a:graphicData uri="http://schemas.openxmlformats.org/drawingml/2006/picture">
-                <pic:pic xmlns:pic="http://schemas.openxmlformats.org/drawingml/2006/picture">
-                  <pic:nvPicPr>
-                    <pic:cNvPr id="822803147" name=""/>
-                    <pic:cNvPicPr/>
-                  </pic:nvPicPr>
-                  <pic:blipFill>
-                    <a:blip r:embed="rId7"/>
-                    <a:stretch>
-                      <a:fillRect/>
-                    </a:stretch>
-                  </pic:blipFill>
-                  <pic:spPr>
-                    <a:xfrm>
-                      <a:off x="0" y="0"/>
-                      <a:ext cx="5943600" cy="3607435"/>
-                    </a:xfrm>
-                    <a:prstGeom prst="rect">
-                      <a:avLst/>
-                    </a:prstGeom>
-                  </pic:spPr>
-                </pic:pic>
-              </a:graphicData>
-            </a:graphic>
-          </wp:inline>
-        </w:drawing>
-      </w:r>
-    </w:p>
-    <w:p>
-      <w:pPr>
-        <w:pStyle w:val="Heading2"/>
-      </w:pPr>
-      <w:r>
-        <w:t>4</w:t>
-      </w:r>
-      <w:r>
-        <w:t>.3 Interpretation &amp; Observations</w:t>
-      </w:r>
-    </w:p>
-    <w:p>
-      <w:pPr>
-        <w:numPr>
-          <w:ilvl w:val="0"/>
-          <w:numId w:val="23"/>
-        </w:numPr>
-      </w:pPr>
-      <w:r>
-        <w:t>Cases with high similarity usually share:</w:t>
-      </w:r>
-    </w:p>
-    <w:p>
-      <w:pPr>
-        <w:numPr>
-          <w:ilvl w:val="1"/>
-          <w:numId w:val="23"/>
-        </w:numPr>
-      </w:pPr>
-      <w:r>
-        <w:t>similar legal issues or statutory references,</w:t>
-      </w:r>
-    </w:p>
-    <w:p>
-      <w:pPr>
-        <w:numPr>
-          <w:ilvl w:val="1"/>
-          <w:numId w:val="23"/>
-        </w:numPr>
-      </w:pPr>
-      <w:r>
-        <w:t>similar phrasing in reasoning (e.g., repeated citations),</w:t>
-      </w:r>
-    </w:p>
-    <w:p>
-      <w:pPr>
-        <w:numPr>
-          <w:ilvl w:val="1"/>
-          <w:numId w:val="23"/>
-        </w:numPr>
-      </w:pPr>
-      <w:r>
-        <w:t>similar fact patterns.</w:t>
-      </w:r>
-    </w:p>
-    <w:p>
-      <w:pPr>
-        <w:numPr>
-          <w:ilvl w:val="0"/>
-          <w:numId w:val="23"/>
-        </w:numPr>
-      </w:pPr>
-      <w:r>
-        <w:t>Limitations observed:</w:t>
-      </w:r>
-    </w:p>
-    <w:p>
-      <w:pPr>
-        <w:numPr>
-          <w:ilvl w:val="1"/>
-          <w:numId w:val="23"/>
-        </w:numPr>
-      </w:pPr>
-      <w:r>
-        <w:t>Averaging sentence embeddings tends to smooth out strong sentence-level signals in very long judgments.</w:t>
-      </w:r>
-    </w:p>
-    <w:p>
-      <w:pPr>
-        <w:numPr>
-          <w:ilvl w:val="1"/>
-          <w:numId w:val="23"/>
-        </w:numPr>
-      </w:pPr>
-      <w:r>
-        <w:t>Off-domain or shallow encoders (not trained on legal corpora) reduce fine-grained semantic discrimination.</w:t>
-      </w:r>
-    </w:p>
-    <w:p>
-      <w:pPr>
-        <w:numPr>
-          <w:ilvl w:val="1"/>
-          <w:numId w:val="23"/>
-        </w:numPr>
-      </w:pPr>
-      <w:r>
-        <w:t>Pre-processing (e.g., removing boilerplate language) can improve retrieval quality.</w:t>
-      </w:r>
-    </w:p>
-    <w:p>
-      <w:r>
-        <w:pict w14:anchorId="081517D9">
-          <v:rect id="_x0000_i1173" style="width:0;height:1.5pt" o:hralign="center" o:hrstd="t" o:hrnoshade="t" o:hr="t" fillcolor="#ccc" stroked="f"/>
-        </w:pict>
-      </w:r>
-    </w:p>
-    <w:p>
-      <w:pPr>
-        <w:pStyle w:val="Heading1"/>
-      </w:pPr>
-      <w:r>
-        <w:lastRenderedPageBreak/>
-        <w:t>Bonuses &amp; Graphs</w:t>
-      </w:r>
-    </w:p>
-    <w:p/>
-    <w:p>
-      <w:r>
-        <w:lastRenderedPageBreak/>
-        <w:drawing>
-          <wp:inline distT="0" distB="0" distL="0" distR="0" wp14:anchorId="4E62C1BE" wp14:editId="290E16FA">
-            <wp:extent cx="5943600" cy="3949065"/>
-            <wp:effectExtent l="0" t="0" r="0" b="0"/>
-            <wp:docPr id="666621214" name="Picture 1"/>
-            <wp:cNvGraphicFramePr>
-              <a:graphicFrameLocks xmlns:a="http://schemas.openxmlformats.org/drawingml/2006/main" noChangeAspect="1"/>
-            </wp:cNvGraphicFramePr>
-            <a:graphic xmlns:a="http://schemas.openxmlformats.org/drawingml/2006/main">
-              <a:graphicData uri="http://schemas.openxmlformats.org/drawingml/2006/picture">
-                <pic:pic xmlns:pic="http://schemas.openxmlformats.org/drawingml/2006/picture">
-                  <pic:nvPicPr>
-                    <pic:cNvPr id="666621214" name=""/>
-                    <pic:cNvPicPr/>
-                  </pic:nvPicPr>
-                  <pic:blipFill>
-                    <a:blip r:embed="rId8"/>
-                    <a:stretch>
-                      <a:fillRect/>
-                    </a:stretch>
-                  </pic:blipFill>
-                  <pic:spPr>
-                    <a:xfrm>
-                      <a:off x="0" y="0"/>
-                      <a:ext cx="5943600" cy="3949065"/>
-                    </a:xfrm>
-                    <a:prstGeom prst="rect">
-                      <a:avLst/>
-                    </a:prstGeom>
-                  </pic:spPr>
-                </pic:pic>
-              </a:graphicData>
-            </a:graphic>
-          </wp:inline>
-        </w:drawing>
-      </w:r>
-      <w:r>
-        <w:rPr>
-          <w:noProof/>
-        </w:rPr>
-        <w:t xml:space="preserve"> </w:t>
-      </w:r>
-      <w:r>
-        <w:drawing>
-          <wp:inline distT="0" distB="0" distL="0" distR="0" wp14:anchorId="5D3176D6" wp14:editId="6C24F179">
-            <wp:extent cx="5943600" cy="2949575"/>
-            <wp:effectExtent l="0" t="0" r="0" b="3175"/>
-            <wp:docPr id="1522395902" name="Picture 1"/>
-            <wp:cNvGraphicFramePr>
-              <a:graphicFrameLocks xmlns:a="http://schemas.openxmlformats.org/drawingml/2006/main" noChangeAspect="1"/>
-            </wp:cNvGraphicFramePr>
-            <a:graphic xmlns:a="http://schemas.openxmlformats.org/drawingml/2006/main">
-              <a:graphicData uri="http://schemas.openxmlformats.org/drawingml/2006/picture">
-                <pic:pic xmlns:pic="http://schemas.openxmlformats.org/drawingml/2006/picture">
-                  <pic:nvPicPr>
-                    <pic:cNvPr id="1522395902" name=""/>
-                    <pic:cNvPicPr/>
-                  </pic:nvPicPr>
-                  <pic:blipFill>
-                    <a:blip r:embed="rId9"/>
-                    <a:stretch>
-                      <a:fillRect/>
-                    </a:stretch>
-                  </pic:blipFill>
-                  <pic:spPr>
-                    <a:xfrm>
-                      <a:off x="0" y="0"/>
-                      <a:ext cx="5943600" cy="2949575"/>
-                    </a:xfrm>
-                    <a:prstGeom prst="rect">
-                      <a:avLst/>
-                    </a:prstGeom>
-                  </pic:spPr>
-                </pic:pic>
-              </a:graphicData>
-            </a:graphic>
-          </wp:inline>
-        </w:drawing>
-      </w:r>
-      <w:r>
-        <w:rPr>
-          <w:noProof/>
-        </w:rPr>
-        <w:t xml:space="preserve"> </w:t>
-      </w:r>
-      <w:r>
-        <w:rPr>
-          <w:noProof/>
-        </w:rPr>
-        <w:lastRenderedPageBreak/>
-        <w:drawing>
-          <wp:inline distT="0" distB="0" distL="0" distR="0" wp14:anchorId="0F4FE660" wp14:editId="17ED9D31">
-            <wp:extent cx="5943600" cy="3949065"/>
-            <wp:effectExtent l="0" t="0" r="0" b="0"/>
-            <wp:docPr id="62019560" name="Picture 1"/>
-            <wp:cNvGraphicFramePr>
-              <a:graphicFrameLocks xmlns:a="http://schemas.openxmlformats.org/drawingml/2006/main" noChangeAspect="1"/>
-            </wp:cNvGraphicFramePr>
-            <a:graphic xmlns:a="http://schemas.openxmlformats.org/drawingml/2006/main">
-              <a:graphicData uri="http://schemas.openxmlformats.org/drawingml/2006/picture">
-                <pic:pic xmlns:pic="http://schemas.openxmlformats.org/drawingml/2006/picture">
-                  <pic:nvPicPr>
-                    <pic:cNvPr id="62019560" name=""/>
-                    <pic:cNvPicPr/>
-                  </pic:nvPicPr>
-                  <pic:blipFill>
-                    <a:blip r:embed="rId10"/>
-                    <a:stretch>
-                      <a:fillRect/>
-                    </a:stretch>
-                  </pic:blipFill>
-                  <pic:spPr>
-                    <a:xfrm>
-                      <a:off x="0" y="0"/>
-                      <a:ext cx="5943600" cy="3949065"/>
-                    </a:xfrm>
-                    <a:prstGeom prst="rect">
-                      <a:avLst/>
-                    </a:prstGeom>
-                  </pic:spPr>
-                </pic:pic>
-              </a:graphicData>
-            </a:graphic>
-          </wp:inline>
-        </w:drawing>
-      </w:r>
-    </w:p>
-    <w:p>
-      <w:r>
-        <w:pict w14:anchorId="221FA58B">
-          <v:rect id="_x0000_i1185" style="width:0;height:1.5pt" o:hralign="center" o:hrstd="t" o:hrnoshade="t" o:hr="t" fillcolor="#ccc" stroked="f"/>
-        </w:pict>
-      </w:r>
-    </w:p>
-    <w:p>
-      <w:r>
-        <w:t>End of report.</w:t>
       </w:r>
     </w:p>
     <w:p/>
@@ -7560,6 +6085,7 @@
   <w:style w:type="character" w:default="1" w:styleId="DefaultParagraphFont">
     <w:name w:val="Default Paragraph Font"/>
     <w:uiPriority w:val="1"/>
+    <w:semiHidden/>
     <w:unhideWhenUsed/>
   </w:style>
   <w:style w:type="table" w:default="1" w:styleId="TableNormal">

</xml_diff>